<commit_message>
Restructure repository for V1.3 and rewrite documentation
Hardware and assets: refresh 3dmodel, replace circurit with the V1.3 EDA project/Gerber/netlist, split datasheet out, and move README images into figure/ instead of docs/images and docs/figures. The experiment and manufacture trees are dropped.

Firmware: replace drv_pid/motor_state/motor_params with motor_ctrl, board, units and app_config, and expose the g_cmd/g_fb interface from motor.h.

Docs: rewrite README and docs/quick-start.md against the V1.3 code and hardware, regenerate docs/适配新电机标准流程.docx around the CFG_* parameters, and fix all file and image references.
</commit_message>
<xml_diff>
--- a/video/temp.docx
+++ b/video/temp.docx
@@ -2,31 +2,6 @@
 <file path=word/document.xml><?xml version="1.0" encoding="utf-8"?>
 <w:document xmlns:wpc="http://schemas.microsoft.com/office/word/2010/wordprocessingCanvas" xmlns:cx="http://schemas.microsoft.com/office/drawing/2014/chartex" xmlns:cx1="http://schemas.microsoft.com/office/drawing/2015/9/8/chartex" xmlns:cx2="http://schemas.microsoft.com/office/drawing/2015/10/21/chartex" xmlns:cx3="http://schemas.microsoft.com/office/drawing/2016/5/9/chartex" xmlns:cx4="http://schemas.microsoft.com/office/drawing/2016/5/10/chartex" xmlns:cx5="http://schemas.microsoft.com/office/drawing/2016/5/11/chartex" xmlns:cx6="http://schemas.microsoft.com/office/drawing/2016/5/12/chartex" xmlns:cx7="http://schemas.microsoft.com/office/drawing/2016/5/13/chartex" xmlns:cx8="http://schemas.microsoft.com/office/drawing/2016/5/14/chartex" xmlns:mc="http://schemas.openxmlformats.org/markup-compatibility/2006" xmlns:aink="http://schemas.microsoft.com/office/drawing/2016/ink" xmlns:am3d="http://schemas.microsoft.com/office/drawing/2017/model3d" xmlns:o="urn:schemas-microsoft-com:office:office" xmlns:oel="http://schemas.microsoft.com/office/2019/extlst" xmlns:r="http://schemas.openxmlformats.org/officeDocument/2006/relationships" xmlns:m="http://schemas.openxmlformats.org/officeDocument/2006/math" xmlns:v="urn:schemas-microsoft-com:vml" xmlns:wp14="http://schemas.microsoft.com/office/word/2010/wordprocessingDrawing" xmlns:wp="http://schemas.openxmlformats.org/drawingml/2006/wordprocessingDrawing" xmlns:w10="urn:schemas-microsoft-com:office:word" xmlns:w="http://schemas.openxmlformats.org/wordprocessingml/2006/main" xmlns:w14="http://schemas.microsoft.com/office/word/2010/wordml" xmlns:w15="http://schemas.microsoft.com/office/word/2012/wordml" xmlns:w16cex="http://schemas.microsoft.com/office/word/2018/wordml/cex" xmlns:w16cid="http://schemas.microsoft.com/office/word/2016/wordml/cid" xmlns:w16="http://schemas.microsoft.com/office/word/2018/wordml" xmlns:w16du="http://schemas.microsoft.com/office/word/2023/wordml/word16du" xmlns:w16sdtdh="http://schemas.microsoft.com/office/word/2020/wordml/sdtdatahash" xmlns:w16sdtfl="http://schemas.microsoft.com/office/word/2024/wordml/sdtformatlock" xmlns:w16se="http://schemas.microsoft.com/office/word/2015/wordml/symex" xmlns:wpg="http://schemas.microsoft.com/office/word/2010/wordprocessingGroup" xmlns:wpi="http://schemas.microsoft.com/office/word/2010/wordprocessingInk" xmlns:wne="http://schemas.microsoft.com/office/word/2006/wordml" xmlns:wps="http://schemas.microsoft.com/office/word/2010/wordprocessingShape" mc:Ignorable="w14 w15 w16se w16cid w16 w16cex w16sdtdh w16sdtfl w16du wp14">
   <w:body>
-    <w:p>
-      <w:pPr>
-        <w:pStyle w:val="3"/>
-      </w:pPr>
-      <w:bookmarkStart w:id="0" w:name="带载测试满载长时间运行"/>
-      <w:r>
-        <w:t>带载测试：满载长时间运行</w:t>
-      </w:r>
-    </w:p>
-    <w:p>
-      <w:pPr>
-        <w:pStyle w:val="ae"/>
-        <w:rPr>
-          <w:lang w:eastAsia="zh-CN"/>
-        </w:rPr>
-      </w:pPr>
-      <w:r>
-        <w:rPr>
-          <w:b/>
-          <w:bCs/>
-          <w:lang w:eastAsia="zh-CN"/>
-        </w:rPr>
-        <w:t>（视频画面：展示电机对拖平台，标注驱动电机、从动发电机、三相整流器和负载；启动系统，并用热成像仪记录电机壳体和驱动板温度。）</w:t>
-      </w:r>
-    </w:p>
     <w:p>
       <w:pPr>
         <w:pStyle w:val="ae"/>
@@ -38,27 +13,39 @@
         <w:rPr>
           <w:lang w:eastAsia="zh-CN"/>
         </w:rPr>
-        <w:t>“接下来进行带载测试。这里采用电机对拖平台：左侧电机由驱动板控制，右侧电机作为发电机，通过三相整流和负载产生反向转矩。这个对拖平台和负载模型也已经开源。</w:t>
+        <w:t>“参数按照电流环、速度环、位置环的顺序，从内到外逐级整定。</w:t>
+      </w:r>
+      <w:r>
+        <w:rPr>
+          <w:rFonts w:hint="eastAsia"/>
+          <w:lang w:eastAsia="zh-CN"/>
+        </w:rPr>
+        <w:t>整定思路</w:t>
+      </w:r>
+      <w:r>
+        <w:rPr>
+          <w:lang w:eastAsia="zh-CN"/>
+        </w:rPr>
+        <w:t>先确定目标交越频率并计算参数，再检查相位裕度，</w:t>
+      </w:r>
+      <w:r>
+        <w:rPr>
+          <w:rFonts w:hint="eastAsia"/>
+          <w:lang w:eastAsia="zh-CN"/>
+        </w:rPr>
+        <w:t>是否在45°左右</w:t>
+      </w:r>
+      <w:r>
+        <w:rPr>
+          <w:lang w:eastAsia="zh-CN"/>
+        </w:rPr>
+        <w:t>”</w:t>
       </w:r>
     </w:p>
     <w:p>
       <w:pPr>
-        <w:pStyle w:val="ae"/>
-      </w:pPr>
-      <w:r>
         <w:rPr>
-          <w:lang w:eastAsia="zh-CN"/>
-        </w:rPr>
-        <w:t>在额定转速和目标负载下持续运行，记录转速、保护状态以及 MOSFET、电源器件和电机壳体的温度变化，观察系统长时间运行后的转速稳定性和热稳定性。</w:t>
-      </w:r>
-      <w:r>
-        <w:t>”</w:t>
-      </w:r>
-    </w:p>
-    <w:bookmarkEnd w:id="0"/>
-    <w:p>
-      <w:pPr>
-        <w:rPr>
+          <w:rFonts w:hint="eastAsia"/>
           <w:b/>
         </w:rPr>
       </w:pPr>
@@ -323,7 +310,7 @@
     <w:lsdException w:name="Body Text 3" w:semiHidden="1" w:unhideWhenUsed="1"/>
     <w:lsdException w:name="Body Text Indent 2" w:semiHidden="1" w:unhideWhenUsed="1"/>
     <w:lsdException w:name="Body Text Indent 3" w:semiHidden="1" w:unhideWhenUsed="1"/>
-    <w:lsdException w:name="Block Text" w:semiHidden="1" w:unhideWhenUsed="1"/>
+    <w:lsdException w:name="Block Text" w:semiHidden="1" w:uiPriority="9" w:unhideWhenUsed="1" w:qFormat="1"/>
     <w:lsdException w:name="Hyperlink" w:semiHidden="1" w:unhideWhenUsed="1"/>
     <w:lsdException w:name="FollowedHyperlink" w:semiHidden="1" w:unhideWhenUsed="1"/>
     <w:lsdException w:name="Strong" w:uiPriority="22" w:qFormat="1"/>
@@ -1306,6 +1293,19 @@
       <w:sz w:val="18"/>
       <w:szCs w:val="18"/>
     </w:rPr>
+  </w:style>
+  <w:style w:type="paragraph" w:styleId="af4">
+    <w:name w:val="Block Text"/>
+    <w:basedOn w:val="ae"/>
+    <w:next w:val="ae"/>
+    <w:uiPriority w:val="9"/>
+    <w:unhideWhenUsed/>
+    <w:qFormat/>
+    <w:rsid w:val="00D8008F"/>
+    <w:pPr>
+      <w:spacing w:before="100" w:after="100"/>
+      <w:ind w:left="480" w:right="480"/>
+    </w:pPr>
   </w:style>
 </w:styles>
 </file>

</xml_diff>